<commit_message>
docs: add data source and CRS notes
</commit_message>
<xml_diff>
--- a/spike/out_delivery/classification_readme.docx
+++ b/spike/out_delivery/classification_readme.docx
@@ -137,6 +137,547 @@
           <w:sz w:val="28"/>
         </w:rPr>
         <w:t xml:space="preserve">2. </w:t>
+      </w:r>
+      <w:r>
+        <w:rPr>
+          <w:rFonts w:ascii="Calibri" w:hAnsi="Calibri" w:eastAsia="PingFang SC"/>
+          <w:b w:val="0"/>
+          <w:color w:val="1F4D78"/>
+          <w:sz w:val="28"/>
+        </w:rPr>
+        <w:t>数据来源与坐标系</w:t>
+      </w:r>
+    </w:p>
+    <w:p>
+      <w:pPr>
+        <w:spacing w:before="0" w:after="120" w:line="300" w:lineRule="auto"/>
+        <w:jc w:val="left"/>
+      </w:pPr>
+      <w:r>
+        <w:rPr>
+          <w:rFonts w:ascii="Calibri" w:hAnsi="Calibri" w:eastAsia="PingFang SC"/>
+          <w:sz w:val="22"/>
+        </w:rPr>
+        <w:t>本 README 固化的是 POI 清洗分类口径。数据来源分为参与计算的高德 POI 原始数据、用于故事背景的公开资料整理表，以及最终交付给制图环节的清洗结果。</w:t>
+      </w:r>
+    </w:p>
+    <w:tbl>
+      <w:tblPr>
+        <w:tblStyle w:val="TableGrid"/>
+        <w:tblW w:type="dxa" w:w="9360"/>
+        <w:jc w:val="center"/>
+        <w:tblLayout w:type="fixed"/>
+        <w:tblLook w:firstColumn="1" w:firstRow="1" w:lastColumn="0" w:lastRow="0" w:noHBand="0" w:noVBand="1" w:val="04A0"/>
+      </w:tblPr>
+      <w:tblGrid>
+        <w:gridCol w:w="3120"/>
+        <w:gridCol w:w="3120"/>
+        <w:gridCol w:w="3120"/>
+      </w:tblGrid>
+      <w:tr>
+        <w:tc>
+          <w:tcPr>
+            <w:tcW w:type="dxa" w:w="2088"/>
+            <w:vAlign w:val="center"/>
+            <w:tcMar>
+              <w:top w:w="80" w:type="dxa"/>
+              <w:start w:w="120" w:type="dxa"/>
+              <w:bottom w:w="80" w:type="dxa"/>
+              <w:end w:w="120" w:type="dxa"/>
+            </w:tcMar>
+            <w:shd w:fill="E8EEF5"/>
+          </w:tcPr>
+          <w:p>
+            <w:r>
+              <w:rPr>
+                <w:rFonts w:ascii="Calibri" w:hAnsi="Calibri" w:eastAsia="PingFang SC"/>
+                <w:b/>
+                <w:sz w:val="20"/>
+              </w:rPr>
+              <w:t>数据项</w:t>
+            </w:r>
+          </w:p>
+        </w:tc>
+        <w:tc>
+          <w:tcPr>
+            <w:tcW w:type="dxa" w:w="6048"/>
+            <w:vAlign w:val="center"/>
+            <w:tcMar>
+              <w:top w:w="80" w:type="dxa"/>
+              <w:start w:w="120" w:type="dxa"/>
+              <w:bottom w:w="80" w:type="dxa"/>
+              <w:end w:w="120" w:type="dxa"/>
+            </w:tcMar>
+            <w:shd w:fill="E8EEF5"/>
+          </w:tcPr>
+          <w:p>
+            <w:r>
+              <w:rPr>
+                <w:rFonts w:ascii="Calibri" w:hAnsi="Calibri" w:eastAsia="PingFang SC"/>
+                <w:b/>
+                <w:sz w:val="20"/>
+              </w:rPr>
+              <w:t>来源与用途</w:t>
+            </w:r>
+          </w:p>
+        </w:tc>
+        <w:tc>
+          <w:tcPr>
+            <w:tcW w:type="dxa" w:w="1224"/>
+            <w:vAlign w:val="center"/>
+            <w:tcMar>
+              <w:top w:w="80" w:type="dxa"/>
+              <w:start w:w="120" w:type="dxa"/>
+              <w:bottom w:w="80" w:type="dxa"/>
+              <w:end w:w="120" w:type="dxa"/>
+            </w:tcMar>
+            <w:shd w:fill="E8EEF5"/>
+          </w:tcPr>
+          <w:p>
+            <w:r>
+              <w:rPr>
+                <w:rFonts w:ascii="Calibri" w:hAnsi="Calibri" w:eastAsia="PingFang SC"/>
+                <w:b/>
+                <w:sz w:val="20"/>
+              </w:rPr>
+              <w:t>参与计算</w:t>
+            </w:r>
+          </w:p>
+        </w:tc>
+      </w:tr>
+      <w:tr>
+        <w:tc>
+          <w:tcPr>
+            <w:tcW w:type="dxa" w:w="3120"/>
+          </w:tcPr>
+          <w:p>
+            <w:pPr>
+              <w:spacing w:before="0" w:after="40" w:line="276" w:lineRule="auto"/>
+              <w:jc w:val="left"/>
+            </w:pPr>
+            <w:r>
+              <w:rPr>
+                <w:rFonts w:ascii="Calibri" w:hAnsi="Calibri" w:eastAsia="PingFang SC"/>
+                <w:sz w:val="20"/>
+              </w:rPr>
+              <w:t>鸡类候选 POI</w:t>
+            </w:r>
+          </w:p>
+        </w:tc>
+        <w:tc>
+          <w:tcPr>
+            <w:tcW w:type="dxa" w:w="3120"/>
+          </w:tcPr>
+          <w:p>
+            <w:pPr>
+              <w:spacing w:before="0" w:after="40" w:line="276" w:lineRule="auto"/>
+              <w:jc w:val="left"/>
+            </w:pPr>
+            <w:r>
+              <w:rPr>
+                <w:rFonts w:ascii="Calibri" w:hAnsi="Calibri" w:eastAsia="PingFang SC"/>
+                <w:sz w:val="20"/>
+              </w:rPr>
+              <w:t>高德地图 POI 原始抓取结果；用于清洗、去重和分类。</w:t>
+            </w:r>
+          </w:p>
+        </w:tc>
+        <w:tc>
+          <w:tcPr>
+            <w:tcW w:type="dxa" w:w="3120"/>
+          </w:tcPr>
+          <w:p>
+            <w:pPr>
+              <w:spacing w:before="0" w:after="40" w:line="276" w:lineRule="auto"/>
+              <w:jc w:val="left"/>
+            </w:pPr>
+            <w:r>
+              <w:rPr>
+                <w:rFonts w:ascii="Calibri" w:hAnsi="Calibri" w:eastAsia="PingFang SC"/>
+                <w:sz w:val="20"/>
+              </w:rPr>
+              <w:t>是</w:t>
+            </w:r>
+          </w:p>
+        </w:tc>
+      </w:tr>
+      <w:tr>
+        <w:tc>
+          <w:tcPr>
+            <w:tcW w:type="dxa" w:w="3120"/>
+          </w:tcPr>
+          <w:p>
+            <w:pPr>
+              <w:spacing w:before="0" w:after="40" w:line="276" w:lineRule="auto"/>
+              <w:jc w:val="left"/>
+            </w:pPr>
+            <w:r>
+              <w:rPr>
+                <w:rFonts w:ascii="Calibri" w:hAnsi="Calibri" w:eastAsia="PingFang SC"/>
+                <w:sz w:val="20"/>
+              </w:rPr>
+              <w:t>全量餐饮 POI</w:t>
+            </w:r>
+          </w:p>
+        </w:tc>
+        <w:tc>
+          <w:tcPr>
+            <w:tcW w:type="dxa" w:w="3120"/>
+          </w:tcPr>
+          <w:p>
+            <w:pPr>
+              <w:spacing w:before="0" w:after="40" w:line="276" w:lineRule="auto"/>
+              <w:jc w:val="left"/>
+            </w:pPr>
+            <w:r>
+              <w:rPr>
+                <w:rFonts w:ascii="Calibri" w:hAnsi="Calibri" w:eastAsia="PingFang SC"/>
+                <w:sz w:val="20"/>
+              </w:rPr>
+              <w:t>高德地图餐饮服务全量样本；作为各区渗透率分母。</w:t>
+            </w:r>
+          </w:p>
+        </w:tc>
+        <w:tc>
+          <w:tcPr>
+            <w:tcW w:type="dxa" w:w="3120"/>
+          </w:tcPr>
+          <w:p>
+            <w:pPr>
+              <w:spacing w:before="0" w:after="40" w:line="276" w:lineRule="auto"/>
+              <w:jc w:val="left"/>
+            </w:pPr>
+            <w:r>
+              <w:rPr>
+                <w:rFonts w:ascii="Calibri" w:hAnsi="Calibri" w:eastAsia="PingFang SC"/>
+                <w:sz w:val="20"/>
+              </w:rPr>
+              <w:t>是</w:t>
+            </w:r>
+          </w:p>
+        </w:tc>
+      </w:tr>
+      <w:tr>
+        <w:tc>
+          <w:tcPr>
+            <w:tcW w:type="dxa" w:w="3120"/>
+          </w:tcPr>
+          <w:p>
+            <w:pPr>
+              <w:spacing w:before="0" w:after="40" w:line="276" w:lineRule="auto"/>
+              <w:jc w:val="left"/>
+            </w:pPr>
+            <w:r>
+              <w:rPr>
+                <w:rFonts w:ascii="Calibri" w:hAnsi="Calibri" w:eastAsia="PingFang SC"/>
+                <w:sz w:val="20"/>
+              </w:rPr>
+              <w:t>背景资料源表</w:t>
+            </w:r>
+          </w:p>
+        </w:tc>
+        <w:tc>
+          <w:tcPr>
+            <w:tcW w:type="dxa" w:w="3120"/>
+          </w:tcPr>
+          <w:p>
+            <w:pPr>
+              <w:spacing w:before="0" w:after="40" w:line="276" w:lineRule="auto"/>
+              <w:jc w:val="left"/>
+            </w:pPr>
+            <w:r>
+              <w:rPr>
+                <w:rFonts w:ascii="Calibri" w:hAnsi="Calibri" w:eastAsia="PingFang SC"/>
+                <w:sz w:val="20"/>
+              </w:rPr>
+              <w:t>公开资料整理表；用于第四章故事背景和外部佐证。</w:t>
+            </w:r>
+          </w:p>
+        </w:tc>
+        <w:tc>
+          <w:tcPr>
+            <w:tcW w:type="dxa" w:w="3120"/>
+          </w:tcPr>
+          <w:p>
+            <w:pPr>
+              <w:spacing w:before="0" w:after="40" w:line="276" w:lineRule="auto"/>
+              <w:jc w:val="left"/>
+            </w:pPr>
+            <w:r>
+              <w:rPr>
+                <w:rFonts w:ascii="Calibri" w:hAnsi="Calibri" w:eastAsia="PingFang SC"/>
+                <w:sz w:val="20"/>
+              </w:rPr>
+              <w:t>否</w:t>
+            </w:r>
+          </w:p>
+        </w:tc>
+      </w:tr>
+      <w:tr>
+        <w:tc>
+          <w:tcPr>
+            <w:tcW w:type="dxa" w:w="3120"/>
+          </w:tcPr>
+          <w:p>
+            <w:pPr>
+              <w:spacing w:before="0" w:after="40" w:line="276" w:lineRule="auto"/>
+              <w:jc w:val="left"/>
+            </w:pPr>
+            <w:r>
+              <w:rPr>
+                <w:rFonts w:ascii="Calibri" w:hAnsi="Calibri" w:eastAsia="PingFang SC"/>
+                <w:sz w:val="20"/>
+              </w:rPr>
+              <w:t>清洗后 POI</w:t>
+            </w:r>
+          </w:p>
+        </w:tc>
+        <w:tc>
+          <w:tcPr>
+            <w:tcW w:type="dxa" w:w="3120"/>
+          </w:tcPr>
+          <w:p>
+            <w:pPr>
+              <w:spacing w:before="0" w:after="40" w:line="276" w:lineRule="auto"/>
+              <w:jc w:val="left"/>
+            </w:pPr>
+            <w:r>
+              <w:rPr>
+                <w:rFonts w:ascii="Calibri" w:hAnsi="Calibri" w:eastAsia="PingFang SC"/>
+                <w:sz w:val="20"/>
+              </w:rPr>
+              <w:t>正式交付给 GeoScene 点图层、分类结构图和空间分析。</w:t>
+            </w:r>
+          </w:p>
+        </w:tc>
+        <w:tc>
+          <w:tcPr>
+            <w:tcW w:type="dxa" w:w="3120"/>
+          </w:tcPr>
+          <w:p>
+            <w:pPr>
+              <w:spacing w:before="0" w:after="40" w:line="276" w:lineRule="auto"/>
+              <w:jc w:val="left"/>
+            </w:pPr>
+            <w:r>
+              <w:rPr>
+                <w:rFonts w:ascii="Calibri" w:hAnsi="Calibri" w:eastAsia="PingFang SC"/>
+                <w:sz w:val="20"/>
+              </w:rPr>
+              <w:t>结果</w:t>
+            </w:r>
+          </w:p>
+        </w:tc>
+      </w:tr>
+      <w:tr>
+        <w:tc>
+          <w:tcPr>
+            <w:tcW w:type="dxa" w:w="3120"/>
+          </w:tcPr>
+          <w:p>
+            <w:pPr>
+              <w:spacing w:before="0" w:after="40" w:line="276" w:lineRule="auto"/>
+              <w:jc w:val="left"/>
+            </w:pPr>
+            <w:r>
+              <w:rPr>
+                <w:rFonts w:ascii="Calibri" w:hAnsi="Calibri" w:eastAsia="PingFang SC"/>
+                <w:sz w:val="20"/>
+              </w:rPr>
+              <w:t>分区渗透率表</w:t>
+            </w:r>
+          </w:p>
+        </w:tc>
+        <w:tc>
+          <w:tcPr>
+            <w:tcW w:type="dxa" w:w="3120"/>
+          </w:tcPr>
+          <w:p>
+            <w:pPr>
+              <w:spacing w:before="0" w:after="40" w:line="276" w:lineRule="auto"/>
+              <w:jc w:val="left"/>
+            </w:pPr>
+            <w:r>
+              <w:rPr>
+                <w:rFonts w:ascii="Calibri" w:hAnsi="Calibri" w:eastAsia="PingFang SC"/>
+                <w:sz w:val="20"/>
+              </w:rPr>
+              <w:t>由鸡类 POI 分子与全量餐饮 POI 分母计算生成。</w:t>
+            </w:r>
+          </w:p>
+        </w:tc>
+        <w:tc>
+          <w:tcPr>
+            <w:tcW w:type="dxa" w:w="3120"/>
+          </w:tcPr>
+          <w:p>
+            <w:pPr>
+              <w:spacing w:before="0" w:after="40" w:line="276" w:lineRule="auto"/>
+              <w:jc w:val="left"/>
+            </w:pPr>
+            <w:r>
+              <w:rPr>
+                <w:rFonts w:ascii="Calibri" w:hAnsi="Calibri" w:eastAsia="PingFang SC"/>
+                <w:sz w:val="20"/>
+              </w:rPr>
+              <w:t>结果</w:t>
+            </w:r>
+          </w:p>
+        </w:tc>
+      </w:tr>
+    </w:tbl>
+    <w:p>
+      <w:pPr>
+        <w:spacing w:after="80" w:line="300" w:lineRule="auto"/>
+        <w:ind w:left="540" w:hanging="271"/>
+      </w:pPr>
+      <w:r>
+        <w:rPr>
+          <w:rFonts w:ascii="Calibri" w:hAnsi="Calibri" w:eastAsia="PingFang SC"/>
+          <w:sz w:val="22"/>
+        </w:rPr>
+        <w:t xml:space="preserve">• </w:t>
+      </w:r>
+      <w:r>
+        <w:rPr>
+          <w:rFonts w:ascii="Calibri" w:hAnsi="Calibri" w:eastAsia="PingFang SC"/>
+          <w:sz w:val="22"/>
+        </w:rPr>
+        <w:t>鸡类候选 POI 原始文件：spike/data/poi_raw_chicken_keyword.jsonl。</w:t>
+      </w:r>
+    </w:p>
+    <w:p>
+      <w:pPr>
+        <w:spacing w:after="80" w:line="300" w:lineRule="auto"/>
+        <w:ind w:left="540" w:hanging="271"/>
+      </w:pPr>
+      <w:r>
+        <w:rPr>
+          <w:rFonts w:ascii="Calibri" w:hAnsi="Calibri" w:eastAsia="PingFang SC"/>
+          <w:sz w:val="22"/>
+        </w:rPr>
+        <w:t xml:space="preserve">• </w:t>
+      </w:r>
+      <w:r>
+        <w:rPr>
+          <w:rFonts w:ascii="Calibri" w:hAnsi="Calibri" w:eastAsia="PingFang SC"/>
+          <w:sz w:val="22"/>
+        </w:rPr>
+        <w:t>全量餐饮 POI 原始文件：spike/data/poi_raw_all_food.jsonl。</w:t>
+      </w:r>
+    </w:p>
+    <w:p>
+      <w:pPr>
+        <w:spacing w:after="80" w:line="300" w:lineRule="auto"/>
+        <w:ind w:left="540" w:hanging="271"/>
+      </w:pPr>
+      <w:r>
+        <w:rPr>
+          <w:rFonts w:ascii="Calibri" w:hAnsi="Calibri" w:eastAsia="PingFang SC"/>
+          <w:sz w:val="22"/>
+        </w:rPr>
+        <w:t xml:space="preserve">• </w:t>
+      </w:r>
+      <w:r>
+        <w:rPr>
+          <w:rFonts w:ascii="Calibri" w:hAnsi="Calibri" w:eastAsia="PingFang SC"/>
+          <w:sz w:val="22"/>
+        </w:rPr>
+        <w:t>背景资料整理表：spike/data/background_context_sources.csv，包含统计年鉴、政府新闻、行业报告、协会报告和媒体报道，仅用于故事背景和引用线索，不参与 POI 分类或渗透率计算。</w:t>
+      </w:r>
+    </w:p>
+    <w:p>
+      <w:pPr>
+        <w:spacing w:after="80" w:line="300" w:lineRule="auto"/>
+        <w:ind w:left="540" w:hanging="271"/>
+      </w:pPr>
+      <w:r>
+        <w:rPr>
+          <w:rFonts w:ascii="Calibri" w:hAnsi="Calibri" w:eastAsia="PingFang SC"/>
+          <w:sz w:val="22"/>
+        </w:rPr>
+        <w:t xml:space="preserve">• </w:t>
+      </w:r>
+      <w:r>
+        <w:rPr>
+          <w:rFonts w:ascii="Calibri" w:hAnsi="Calibri" w:eastAsia="PingFang SC"/>
+          <w:sz w:val="22"/>
+        </w:rPr>
+        <w:t>正式交付文件：spike/out_delivery/poi_clean.csv、poi_clean.geojson 与 penetration_by_district.csv。</w:t>
+      </w:r>
+    </w:p>
+    <w:p>
+      <w:pPr>
+        <w:spacing w:after="80" w:line="300" w:lineRule="auto"/>
+        <w:ind w:left="540" w:hanging="271"/>
+      </w:pPr>
+      <w:r>
+        <w:rPr>
+          <w:rFonts w:ascii="Calibri" w:hAnsi="Calibri" w:eastAsia="PingFang SC"/>
+          <w:sz w:val="22"/>
+        </w:rPr>
+        <w:t xml:space="preserve">• </w:t>
+      </w:r>
+      <w:r>
+        <w:rPr>
+          <w:rFonts w:ascii="Calibri" w:hAnsi="Calibri" w:eastAsia="PingFang SC"/>
+          <w:sz w:val="22"/>
+        </w:rPr>
+        <w:t>原始高德 POI 的 location 字段为 GCJ-02 坐标。</w:t>
+      </w:r>
+    </w:p>
+    <w:p>
+      <w:pPr>
+        <w:spacing w:after="80" w:line="300" w:lineRule="auto"/>
+        <w:ind w:left="540" w:hanging="271"/>
+      </w:pPr>
+      <w:r>
+        <w:rPr>
+          <w:rFonts w:ascii="Calibri" w:hAnsi="Calibri" w:eastAsia="PingFang SC"/>
+          <w:sz w:val="22"/>
+        </w:rPr>
+        <w:t xml:space="preserve">• </w:t>
+      </w:r>
+      <w:r>
+        <w:rPr>
+          <w:rFonts w:ascii="Calibri" w:hAnsi="Calibri" w:eastAsia="PingFang SC"/>
+          <w:sz w:val="22"/>
+        </w:rPr>
+        <w:t>当前 out_delivery 交付数据由 python3 spike/build_delivery_data.py 生成，未使用 --keep-gcj02，因此 lng/lat 输出为 WGS-84。</w:t>
+      </w:r>
+    </w:p>
+    <w:p>
+      <w:pPr>
+        <w:spacing w:after="80" w:line="300" w:lineRule="auto"/>
+        <w:ind w:left="540" w:hanging="271"/>
+      </w:pPr>
+      <w:r>
+        <w:rPr>
+          <w:rFonts w:ascii="Calibri" w:hAnsi="Calibri" w:eastAsia="PingFang SC"/>
+          <w:sz w:val="22"/>
+        </w:rPr>
+        <w:t xml:space="preserve">• </w:t>
+      </w:r>
+      <w:r>
+        <w:rPr>
+          <w:rFonts w:ascii="Calibri" w:hAnsi="Calibri" w:eastAsia="PingFang SC"/>
+          <w:sz w:val="22"/>
+        </w:rPr>
+        <w:t>如果后续使用高德或其他 GCJ-02 底图，应另行用 --keep-gcj02 导出一版，不能与当前 WGS-84 结果混用。</w:t>
+      </w:r>
+    </w:p>
+    <w:p>
+      <w:pPr>
+        <w:spacing w:before="320" w:after="160"/>
+      </w:pPr>
+      <w:r>
+        <w:rPr>
+          <w:rFonts w:ascii="Calibri" w:hAnsi="Calibri" w:eastAsia="PingFang SC"/>
+          <w:b/>
+          <w:color w:val="1F4D78"/>
+          <w:sz w:val="28"/>
+        </w:rPr>
+        <w:t xml:space="preserve">3. </w:t>
       </w:r>
       <w:r>
         <w:rPr>
@@ -399,7 +940,7 @@
                 <w:rFonts w:ascii="Calibri" w:hAnsi="Calibri" w:eastAsia="PingFang SC"/>
                 <w:sz w:val="20"/>
               </w:rPr>
-              <w:t>现代/外来鸡类消费场景扩张</w:t>
+              <w:t>快餐化和外来鸡类消费场景扩张</w:t>
             </w:r>
           </w:p>
         </w:tc>
@@ -638,7 +1179,7 @@
           <w:color w:val="1F4D78"/>
           <w:sz w:val="28"/>
         </w:rPr>
-        <w:t xml:space="preserve">3. </w:t>
+        <w:t xml:space="preserve">4. </w:t>
       </w:r>
       <w:r>
         <w:rPr>
@@ -760,7 +1301,7 @@
           <w:rFonts w:ascii="Calibri" w:hAnsi="Calibri" w:eastAsia="PingFang SC"/>
           <w:sz w:val="22"/>
         </w:rPr>
-        <w:t>明确外地/现代/连锁化鸡菜判为 modern。</w:t>
+        <w:t>明确外地、现代或连锁化鸡菜判为 modern。</w:t>
       </w:r>
     </w:p>
     <w:p>
@@ -794,7 +1335,7 @@
           <w:color w:val="1F4D78"/>
           <w:sz w:val="28"/>
         </w:rPr>
-        <w:t xml:space="preserve">4. </w:t>
+        <w:t xml:space="preserve">5. </w:t>
       </w:r>
       <w:r>
         <w:rPr>
@@ -997,7 +1538,7 @@
                 <w:rFonts w:ascii="Calibri" w:hAnsi="Calibri" w:eastAsia="PingFang SC"/>
                 <w:sz w:val="20"/>
               </w:rPr>
-              <w:t>鸡肉披萨、奥尔良烤鸡、照烧鸡肉等属于现代/西式餐饮语境。</w:t>
+              <w:t>鸡肉披萨、奥尔良烤鸡、照烧鸡肉等属于现代或西式餐饮语境。</w:t>
             </w:r>
           </w:p>
         </w:tc>
@@ -1165,7 +1706,7 @@
                 <w:rFonts w:ascii="Calibri" w:hAnsi="Calibri" w:eastAsia="PingFang SC"/>
                 <w:sz w:val="20"/>
               </w:rPr>
-              <w:t>无地域修饰时按现代/外来烧鸡处理。</w:t>
+              <w:t>无地域修饰时按现代或外来烧鸡处理。</w:t>
             </w:r>
           </w:p>
         </w:tc>
@@ -1462,7 +2003,7 @@
           <w:color w:val="1F4D78"/>
           <w:sz w:val="28"/>
         </w:rPr>
-        <w:t xml:space="preserve">5. </w:t>
+        <w:t xml:space="preserve">6. </w:t>
       </w:r>
       <w:r>
         <w:rPr>
@@ -1491,7 +2032,7 @@
           <w:rFonts w:ascii="Calibri" w:hAnsi="Calibri" w:eastAsia="PingFang SC"/>
           <w:sz w:val="22"/>
         </w:rPr>
-        <w:t>做“传统 vs 现代”结构图时，只比较 traditional 与 modern，other_chicken 单独作为无法归属类展示。</w:t>
+        <w:t>做“传统与现代”结构图时，只比较 traditional 与 modern，other_chicken 单独作为无法归属类展示。</w:t>
       </w:r>
     </w:p>
     <w:p>
@@ -1545,7 +2086,7 @@
           <w:color w:val="1F4D78"/>
           <w:sz w:val="28"/>
         </w:rPr>
-        <w:t xml:space="preserve">6. </w:t>
+        <w:t xml:space="preserve">7. </w:t>
       </w:r>
       <w:r>
         <w:rPr>
@@ -1933,7 +2474,7 @@
           <w:color w:val="1F4D78"/>
           <w:sz w:val="28"/>
         </w:rPr>
-        <w:t xml:space="preserve">7. </w:t>
+        <w:t xml:space="preserve">8. </w:t>
       </w:r>
       <w:r>
         <w:rPr>

</xml_diff>